<commit_message>
Start-here box, Article 54 service, the provider's objections as a page, the wiki episode in the matrix
Co-Authored-By: Claude Fable 5.1 <noreply@anthropic.com>
Claude-Session: https://claude.ai/code/session_01YD2z9MgrfhWGbX1Dq611UW
</commit_message>
<xml_diff>
--- a/instrument/docx/issuing-note.docx
+++ b/instrument/docx/issuing-note.docx
@@ -1441,11 +1441,29 @@
       <w:pPr>
         <w:pStyle w:val="Heading2"/>
       </w:pPr>
-      <w:bookmarkStart w:id="24" w:name="X1aef7e408b3d2589c0b7024fca2d8e7265b7ca7"/>
-      <w:r>
-        <w:t xml:space="preserve">4. After the answers</w:t>
+      <w:bookmarkStart w:id="24" w:name="X4c8e34ec63e3692486b1ce07fe86a5bc2d0c8c3"/>
+      <w:r>
+        <w:t xml:space="preserve">4. Service</w:t>
       </w:r>
       <w:bookmarkEnd w:id="24"/>
+    </w:p>
+    <w:p>
+      <w:pPr>
+        <w:pStyle w:val="FirstParagraph"/>
+      </w:pPr>
+      <w:r>
+        <w:t xml:space="preserve">Article 54(1) requires a provider established in a third country to appoint, by written mandate, an authorised representative established in the Union before placing a general-purpose AI model on the Union market. The request is addressed to the Provider and served on that representative as well, and Request 4a asks whether and when one was appointed in respect of the Research Model or its lineage. The date answers a question of its own: an appointment made before the Evaluation is the Provider’s own contemporaneous view that a model of that lineage was headed for the Union market.</w:t>
+      </w:r>
+    </w:p>
+    <w:p>
+      <w:pPr>
+        <w:pStyle w:val="Heading2"/>
+      </w:pPr>
+      <w:bookmarkStart w:id="25" w:name="Xfee2cc169e16253fdc9df9942fba966a1a114cc"/>
+      <w:r>
+        <w:t xml:space="preserve">5. After the answers</w:t>
+      </w:r>
+      <w:bookmarkEnd w:id="25"/>
     </w:p>
     <w:p>
       <w:pPr>

</xml_diff>